<commit_message>
Make the Table of Contents display in all viewers (57 docs)
The TOC is a Word field whose cached result was empty, so it showed blank in
any viewer that does not recompute fields (the "table of contents is not
available" symptom, and the CoE TOC finding).

Inject a visible, hyperlinked contents list into the TOC field of every
document that has one (57 files), with bookmarks added to each heading so the
entries are clickable. It remains a live TOC field, so Microsoft Word still
refreshes page numbers on update. Forms, checklists and registers without a
TOC are unchanged. Each file re-validated.

Co-Authored-By: Claude Opus 4.8 <noreply@anthropic.com>
Claude-Session: https://claude.ai/code/session_01Gkd3K8tDngLcQLDrM4dcJc
</commit_message>
<xml_diff>
--- a/New HSSE Management System 2026/00-Governance/01-DAN-DQR-QMS-000001__Jun_2026_R00_Design_Quality_Requirements.docx
+++ b/New HSSE Management System 2026/00-Governance/01-DAN-DQR-QMS-000001__Jun_2026_R00_Design_Quality_Requirements.docx
@@ -972,6 +972,322 @@
           </w:r>
         </w:p>
         <w:p>
+          <w:pPr>
+            <w:spacing w:after="40" w:line="259"/>
+            <w:ind w:left="0"/>
+          </w:pPr>
+          <w:hyperlink w:anchor="_DanToc9000" w:history="1">
+            <w:r>
+              <w:rPr>
+                <w:rFonts w:ascii="Tahoma" w:hAnsi="Tahoma" w:cs="Tahoma"/>
+                <w:b/>
+                <w:color w:val="542A12"/>
+                <w:sz w:val="20"/>
+              </w:rPr>
+              <w:t xml:space="preserve">Document Control — Review and Approval</w:t>
+            </w:r>
+          </w:hyperlink>
+        </w:p>
+        <w:p>
+          <w:pPr>
+            <w:spacing w:after="40" w:line="259"/>
+            <w:ind w:left="0"/>
+          </w:pPr>
+          <w:hyperlink w:anchor="_DanToc9001" w:history="1">
+            <w:r>
+              <w:rPr>
+                <w:rFonts w:ascii="Tahoma" w:hAnsi="Tahoma" w:cs="Tahoma"/>
+                <w:b/>
+                <w:color w:val="542A12"/>
+                <w:sz w:val="20"/>
+              </w:rPr>
+              <w:t xml:space="preserve">Purpose</w:t>
+            </w:r>
+          </w:hyperlink>
+        </w:p>
+        <w:p>
+          <w:pPr>
+            <w:spacing w:after="40" w:line="259"/>
+            <w:ind w:left="0"/>
+          </w:pPr>
+          <w:hyperlink w:anchor="_DanToc9002" w:history="1">
+            <w:r>
+              <w:rPr>
+                <w:rFonts w:ascii="Tahoma" w:hAnsi="Tahoma" w:cs="Tahoma"/>
+                <w:b/>
+                <w:color w:val="542A12"/>
+                <w:sz w:val="20"/>
+              </w:rPr>
+              <w:t xml:space="preserve">1.  Overview and Scope</w:t>
+            </w:r>
+          </w:hyperlink>
+        </w:p>
+        <w:p>
+          <w:pPr>
+            <w:spacing w:after="40" w:line="259"/>
+            <w:ind w:left="0"/>
+          </w:pPr>
+          <w:hyperlink w:anchor="_DanToc9003" w:history="1">
+            <w:r>
+              <w:rPr>
+                <w:rFonts w:ascii="Tahoma" w:hAnsi="Tahoma" w:cs="Tahoma"/>
+                <w:b/>
+                <w:color w:val="542A12"/>
+                <w:sz w:val="20"/>
+              </w:rPr>
+              <w:t xml:space="preserve">2.  Employer's Requirements (ER)</w:t>
+            </w:r>
+          </w:hyperlink>
+        </w:p>
+        <w:p>
+          <w:pPr>
+            <w:spacing w:after="40" w:line="259"/>
+            <w:ind w:left="360"/>
+          </w:pPr>
+          <w:hyperlink w:anchor="_DanToc9004" w:history="1">
+            <w:r>
+              <w:rPr>
+                <w:rFonts w:ascii="Tahoma" w:hAnsi="Tahoma" w:cs="Tahoma"/>
+                <w:color w:val="444444"/>
+                <w:sz w:val="19"/>
+              </w:rPr>
+              <w:t xml:space="preserve">2.1  Scope</w:t>
+            </w:r>
+          </w:hyperlink>
+        </w:p>
+        <w:p>
+          <w:pPr>
+            <w:spacing w:after="40" w:line="259"/>
+            <w:ind w:left="360"/>
+          </w:pPr>
+          <w:hyperlink w:anchor="_DanToc9005" w:history="1">
+            <w:r>
+              <w:rPr>
+                <w:rFonts w:ascii="Tahoma" w:hAnsi="Tahoma" w:cs="Tahoma"/>
+                <w:color w:val="444444"/>
+                <w:sz w:val="19"/>
+              </w:rPr>
+              <w:t xml:space="preserve">2.2  Node Programme</w:t>
+            </w:r>
+          </w:hyperlink>
+        </w:p>
+        <w:p>
+          <w:pPr>
+            <w:spacing w:after="40" w:line="259"/>
+            <w:ind w:left="360"/>
+          </w:pPr>
+          <w:hyperlink w:anchor="_DanToc9006" w:history="1">
+            <w:r>
+              <w:rPr>
+                <w:rFonts w:ascii="Tahoma" w:hAnsi="Tahoma" w:cs="Tahoma"/>
+                <w:color w:val="444444"/>
+                <w:sz w:val="19"/>
+              </w:rPr>
+              <w:t xml:space="preserve">2.3  Amenity Inclusion</w:t>
+            </w:r>
+          </w:hyperlink>
+        </w:p>
+        <w:p>
+          <w:pPr>
+            <w:spacing w:after="40" w:line="259"/>
+            <w:ind w:left="360"/>
+          </w:pPr>
+          <w:hyperlink w:anchor="_DanToc9007" w:history="1">
+            <w:r>
+              <w:rPr>
+                <w:rFonts w:ascii="Tahoma" w:hAnsi="Tahoma" w:cs="Tahoma"/>
+                <w:color w:val="444444"/>
+                <w:sz w:val="19"/>
+              </w:rPr>
+              <w:t xml:space="preserve">2.4  Theming and Design Intent</w:t>
+            </w:r>
+          </w:hyperlink>
+        </w:p>
+        <w:p>
+          <w:pPr>
+            <w:spacing w:after="40" w:line="259"/>
+            <w:ind w:left="360"/>
+          </w:pPr>
+          <w:hyperlink w:anchor="_DanToc9008" w:history="1">
+            <w:r>
+              <w:rPr>
+                <w:rFonts w:ascii="Tahoma" w:hAnsi="Tahoma" w:cs="Tahoma"/>
+                <w:color w:val="444444"/>
+                <w:sz w:val="19"/>
+              </w:rPr>
+              <w:t xml:space="preserve">2.5  Design Standards</w:t>
+            </w:r>
+          </w:hyperlink>
+        </w:p>
+        <w:p>
+          <w:pPr>
+            <w:spacing w:after="40" w:line="259"/>
+            <w:ind w:left="0"/>
+          </w:pPr>
+          <w:hyperlink w:anchor="_DanToc9009" w:history="1">
+            <w:r>
+              <w:rPr>
+                <w:rFonts w:ascii="Tahoma" w:hAnsi="Tahoma" w:cs="Tahoma"/>
+                <w:b/>
+                <w:color w:val="542A12"/>
+                <w:sz w:val="20"/>
+              </w:rPr>
+              <w:t xml:space="preserve">3.  Roles and Responsibilities</w:t>
+            </w:r>
+          </w:hyperlink>
+        </w:p>
+        <w:p>
+          <w:pPr>
+            <w:spacing w:after="40" w:line="259"/>
+            <w:ind w:left="360"/>
+          </w:pPr>
+          <w:hyperlink w:anchor="_DanToc9010" w:history="1">
+            <w:r>
+              <w:rPr>
+                <w:rFonts w:ascii="Tahoma" w:hAnsi="Tahoma" w:cs="Tahoma"/>
+                <w:color w:val="444444"/>
+                <w:sz w:val="19"/>
+              </w:rPr>
+              <w:t xml:space="preserve">3.1  RACI Matrix</w:t>
+            </w:r>
+          </w:hyperlink>
+        </w:p>
+        <w:p>
+          <w:pPr>
+            <w:spacing w:after="40" w:line="259"/>
+            <w:ind w:left="0"/>
+          </w:pPr>
+          <w:hyperlink w:anchor="_DanToc9011" w:history="1">
+            <w:r>
+              <w:rPr>
+                <w:rFonts w:ascii="Tahoma" w:hAnsi="Tahoma" w:cs="Tahoma"/>
+                <w:b/>
+                <w:color w:val="542A12"/>
+                <w:sz w:val="20"/>
+              </w:rPr>
+              <w:t xml:space="preserve">4.  Inputs Required for Design</w:t>
+            </w:r>
+          </w:hyperlink>
+        </w:p>
+        <w:p>
+          <w:pPr>
+            <w:spacing w:after="40" w:line="259"/>
+            <w:ind w:left="0"/>
+          </w:pPr>
+          <w:hyperlink w:anchor="_DanToc9012" w:history="1">
+            <w:r>
+              <w:rPr>
+                <w:rFonts w:ascii="Tahoma" w:hAnsi="Tahoma" w:cs="Tahoma"/>
+                <w:b/>
+                <w:color w:val="542A12"/>
+                <w:sz w:val="20"/>
+              </w:rPr>
+              <w:t xml:space="preserve">5.  Design Process</w:t>
+            </w:r>
+          </w:hyperlink>
+        </w:p>
+        <w:p>
+          <w:pPr>
+            <w:spacing w:after="40" w:line="259"/>
+            <w:ind w:left="0"/>
+          </w:pPr>
+          <w:hyperlink w:anchor="_DanToc9013" w:history="1">
+            <w:r>
+              <w:rPr>
+                <w:rFonts w:ascii="Tahoma" w:hAnsi="Tahoma" w:cs="Tahoma"/>
+                <w:b/>
+                <w:color w:val="542A12"/>
+                <w:sz w:val="20"/>
+              </w:rPr>
+              <w:t xml:space="preserve">6.  Design Process Quality Control</w:t>
+            </w:r>
+          </w:hyperlink>
+        </w:p>
+        <w:p>
+          <w:pPr>
+            <w:spacing w:after="40" w:line="259"/>
+            <w:ind w:left="0"/>
+          </w:pPr>
+          <w:hyperlink w:anchor="_DanToc9014" w:history="1">
+            <w:r>
+              <w:rPr>
+                <w:rFonts w:ascii="Tahoma" w:hAnsi="Tahoma" w:cs="Tahoma"/>
+                <w:b/>
+                <w:color w:val="542A12"/>
+                <w:sz w:val="20"/>
+              </w:rPr>
+              <w:t xml:space="preserve">7.  Design Documents Control</w:t>
+            </w:r>
+          </w:hyperlink>
+        </w:p>
+        <w:p>
+          <w:pPr>
+            <w:spacing w:after="40" w:line="259"/>
+            <w:ind w:left="0"/>
+          </w:pPr>
+          <w:hyperlink w:anchor="_DanToc9015" w:history="1">
+            <w:r>
+              <w:rPr>
+                <w:rFonts w:ascii="Tahoma" w:hAnsi="Tahoma" w:cs="Tahoma"/>
+                <w:b/>
+                <w:color w:val="542A12"/>
+                <w:sz w:val="20"/>
+              </w:rPr>
+              <w:t xml:space="preserve">8.  Templates</w:t>
+            </w:r>
+          </w:hyperlink>
+        </w:p>
+        <w:p>
+          <w:pPr>
+            <w:spacing w:after="40" w:line="259"/>
+            <w:ind w:left="0"/>
+          </w:pPr>
+          <w:hyperlink w:anchor="_DanToc9016" w:history="1">
+            <w:r>
+              <w:rPr>
+                <w:rFonts w:ascii="Tahoma" w:hAnsi="Tahoma" w:cs="Tahoma"/>
+                <w:b/>
+                <w:color w:val="542A12"/>
+                <w:sz w:val="20"/>
+              </w:rPr>
+              <w:t xml:space="preserve">Attachments and Templates</w:t>
+            </w:r>
+          </w:hyperlink>
+        </w:p>
+        <w:p>
+          <w:pPr>
+            <w:spacing w:after="40" w:line="259"/>
+            <w:ind w:left="360"/>
+          </w:pPr>
+          <w:hyperlink w:anchor="_DanToc9017" w:history="1">
+            <w:r>
+              <w:rPr>
+                <w:rFonts w:ascii="Tahoma" w:hAnsi="Tahoma" w:cs="Tahoma"/>
+                <w:color w:val="444444"/>
+                <w:sz w:val="19"/>
+              </w:rPr>
+              <w:t xml:space="preserve">A1 — Design Review Process Map</w:t>
+            </w:r>
+          </w:hyperlink>
+        </w:p>
+        <w:p>
+          <w:pPr>
+            <w:spacing w:after="40" w:line="259"/>
+            <w:ind w:left="0"/>
+          </w:pPr>
+          <w:hyperlink w:anchor="_DanToc9018" w:history="1">
+            <w:r>
+              <w:rPr>
+                <w:rFonts w:ascii="Tahoma" w:hAnsi="Tahoma" w:cs="Tahoma"/>
+                <w:b/>
+                <w:color w:val="542A12"/>
+                <w:sz w:val="20"/>
+              </w:rPr>
+              <w:t xml:space="preserve">Revision History</w:t>
+            </w:r>
+          </w:hyperlink>
+        </w:p>
+        <w:p>
           <w:r>
             <w:fldChar w:fldCharType="end"/>
           </w:r>
@@ -987,9 +1303,11 @@
       <w:pPr>
         <w:pStyle w:val="Heading1"/>
       </w:pPr>
+      <w:bookmarkStart w:id="9000" w:name="_DanToc9000"/>
       <w:r>
         <w:t xml:space="preserve">Document Control — Review and Approval</w:t>
       </w:r>
+      <w:bookmarkEnd w:id="9000"/>
     </w:p>
     <w:p>
       <w:pPr>
@@ -1740,9 +2058,11 @@
       <w:pPr>
         <w:pStyle w:val="Heading1"/>
       </w:pPr>
+      <w:bookmarkStart w:id="9001" w:name="_DanToc9001"/>
       <w:r>
         <w:t xml:space="preserve">Purpose</w:t>
       </w:r>
+      <w:bookmarkEnd w:id="9001"/>
     </w:p>
     <w:p>
       <w:pPr>
@@ -1787,9 +2107,11 @@
       <w:pPr>
         <w:pStyle w:val="Heading1"/>
       </w:pPr>
+      <w:bookmarkStart w:id="9002" w:name="_DanToc9002"/>
       <w:r>
         <w:t xml:space="preserve">1.  Overview and Scope</w:t>
       </w:r>
+      <w:bookmarkEnd w:id="9002"/>
     </w:p>
     <w:p>
       <w:pPr>
@@ -1866,9 +2188,11 @@
       <w:pPr>
         <w:pStyle w:val="Heading1"/>
       </w:pPr>
+      <w:bookmarkStart w:id="9003" w:name="_DanToc9003"/>
       <w:r>
         <w:t xml:space="preserve">2.  Employer's Requirements (ER)</w:t>
       </w:r>
+      <w:bookmarkEnd w:id="9003"/>
     </w:p>
     <w:p>
       <w:pPr>
@@ -1888,9 +2212,11 @@
       <w:pPr>
         <w:pStyle w:val="Heading2"/>
       </w:pPr>
+      <w:bookmarkStart w:id="9004" w:name="_DanToc9004"/>
       <w:r>
         <w:t xml:space="preserve">2.1  Scope</w:t>
       </w:r>
+      <w:bookmarkEnd w:id="9004"/>
     </w:p>
     <w:p>
       <w:pPr>
@@ -1910,9 +2236,11 @@
       <w:pPr>
         <w:pStyle w:val="Heading2"/>
       </w:pPr>
+      <w:bookmarkStart w:id="9005" w:name="_DanToc9005"/>
       <w:r>
         <w:t xml:space="preserve">2.2  Node Programme</w:t>
       </w:r>
+      <w:bookmarkEnd w:id="9005"/>
     </w:p>
     <w:p>
       <w:pPr>
@@ -1932,9 +2260,11 @@
       <w:pPr>
         <w:pStyle w:val="Heading2"/>
       </w:pPr>
+      <w:bookmarkStart w:id="9006" w:name="_DanToc9006"/>
       <w:r>
         <w:t xml:space="preserve">2.3  Amenity Inclusion</w:t>
       </w:r>
+      <w:bookmarkEnd w:id="9006"/>
     </w:p>
     <w:p>
       <w:pPr>
@@ -1954,9 +2284,11 @@
       <w:pPr>
         <w:pStyle w:val="Heading2"/>
       </w:pPr>
+      <w:bookmarkStart w:id="9007" w:name="_DanToc9007"/>
       <w:r>
         <w:t xml:space="preserve">2.4  Theming and Design Intent</w:t>
       </w:r>
+      <w:bookmarkEnd w:id="9007"/>
     </w:p>
     <w:p>
       <w:pPr>
@@ -1976,9 +2308,11 @@
       <w:pPr>
         <w:pStyle w:val="Heading2"/>
       </w:pPr>
+      <w:bookmarkStart w:id="9008" w:name="_DanToc9008"/>
       <w:r>
         <w:t xml:space="preserve">2.5  Design Standards</w:t>
       </w:r>
+      <w:bookmarkEnd w:id="9008"/>
     </w:p>
     <w:p>
       <w:pPr>
@@ -2074,9 +2408,11 @@
       <w:pPr>
         <w:pStyle w:val="Heading1"/>
       </w:pPr>
+      <w:bookmarkStart w:id="9009" w:name="_DanToc9009"/>
       <w:r>
         <w:t xml:space="preserve">3.  Roles and Responsibilities</w:t>
       </w:r>
+      <w:bookmarkEnd w:id="9009"/>
     </w:p>
     <w:p>
       <w:pPr>
@@ -2191,9 +2527,11 @@
       <w:pPr>
         <w:pStyle w:val="Heading2"/>
       </w:pPr>
+      <w:bookmarkStart w:id="9010" w:name="_DanToc9010"/>
       <w:r>
         <w:t xml:space="preserve">3.1  RACI Matrix</w:t>
       </w:r>
+      <w:bookmarkEnd w:id="9010"/>
     </w:p>
     <w:p>
       <w:pPr>
@@ -4015,9 +4353,11 @@
       <w:pPr>
         <w:pStyle w:val="Heading1"/>
       </w:pPr>
+      <w:bookmarkStart w:id="9011" w:name="_DanToc9011"/>
       <w:r>
         <w:t xml:space="preserve">4.  Inputs Required for Design</w:t>
       </w:r>
+      <w:bookmarkEnd w:id="9011"/>
     </w:p>
     <w:p>
       <w:pPr>
@@ -4151,9 +4491,11 @@
       <w:pPr>
         <w:pStyle w:val="Heading1"/>
       </w:pPr>
+      <w:bookmarkStart w:id="9012" w:name="_DanToc9012"/>
       <w:r>
         <w:t xml:space="preserve">5.  Design Process</w:t>
       </w:r>
+      <w:bookmarkEnd w:id="9012"/>
     </w:p>
     <w:p>
       <w:pPr>
@@ -4292,9 +4634,11 @@
       <w:pPr>
         <w:pStyle w:val="Heading1"/>
       </w:pPr>
+      <w:bookmarkStart w:id="9013" w:name="_DanToc9013"/>
       <w:r>
         <w:t xml:space="preserve">6.  Design Process Quality Control</w:t>
       </w:r>
+      <w:bookmarkEnd w:id="9013"/>
     </w:p>
     <w:p>
       <w:pPr>
@@ -4395,9 +4739,11 @@
       <w:pPr>
         <w:pStyle w:val="Heading1"/>
       </w:pPr>
+      <w:bookmarkStart w:id="9014" w:name="_DanToc9014"/>
       <w:r>
         <w:t xml:space="preserve">7.  Design Documents Control</w:t>
       </w:r>
+      <w:bookmarkEnd w:id="9014"/>
     </w:p>
     <w:p>
       <w:pPr>
@@ -4517,9 +4863,11 @@
       <w:pPr>
         <w:pStyle w:val="Heading1"/>
       </w:pPr>
+      <w:bookmarkStart w:id="9015" w:name="_DanToc9015"/>
       <w:r>
         <w:t xml:space="preserve">8.  Templates</w:t>
       </w:r>
+      <w:bookmarkEnd w:id="9015"/>
     </w:p>
     <w:p>
       <w:pPr>
@@ -4596,9 +4944,11 @@
       <w:pPr>
         <w:pStyle w:val="Heading1"/>
       </w:pPr>
+      <w:bookmarkStart w:id="9016" w:name="_DanToc9016"/>
       <w:r>
         <w:t xml:space="preserve">Attachments and Templates</w:t>
       </w:r>
+      <w:bookmarkEnd w:id="9016"/>
     </w:p>
     <w:p>
       <w:pPr>
@@ -4952,9 +5302,11 @@
       <w:pPr>
         <w:pStyle w:val="Heading2"/>
       </w:pPr>
+      <w:bookmarkStart w:id="9017" w:name="_DanToc9017"/>
       <w:r>
         <w:t xml:space="preserve">A1 — Design Review Process Map</w:t>
       </w:r>
+      <w:bookmarkEnd w:id="9017"/>
     </w:p>
     <w:p>
       <w:pPr>
@@ -5038,9 +5390,11 @@
       <w:pPr>
         <w:pStyle w:val="Heading1"/>
       </w:pPr>
+      <w:bookmarkStart w:id="9018" w:name="_DanToc9018"/>
       <w:r>
         <w:t xml:space="preserve">Revision History</w:t>
       </w:r>
+      <w:bookmarkEnd w:id="9018"/>
     </w:p>
     <w:tbl>
       <w:tblPr>

</xml_diff>

<commit_message>
Redraw the Design Review Process Map for clarity (DQR A1)
Replace the tall, low-legibility process map with a near-square, full-width
single-column flow: numbered stage badges, bold titles and readable subtitles,
rendered at high resolution so it stays crisp when placed on the page. Keeps
Tahoma throughout and the visible table of contents; re-validated.

Co-Authored-By: Claude Opus 4.8 <noreply@anthropic.com>
Claude-Session: https://claude.ai/code/session_01Gkd3K8tDngLcQLDrM4dcJc
</commit_message>
<xml_diff>
--- a/New HSSE Management System 2026/00-Governance/01-DAN-DQR-QMS-000001__Jun_2026_R00_Design_Quality_Requirements.docx
+++ b/New HSSE Management System 2026/00-Governance/01-DAN-DQR-QMS-000001__Jun_2026_R00_Design_Quality_Requirements.docx
@@ -5331,7 +5331,7 @@
       <w:r>
         <w:drawing>
           <wp:inline distT="0" distB="0" distL="0" distR="0">
-            <wp:extent cx="2343150" cy="4476750"/>
+            <wp:extent cx="4095750" cy="4343400"/>
             <wp:effectExtent t="0" r="0" b="0" l="0"/>
             <wp:docPr id="1" name="Attachment A1 — Design Review Process Map" descr="Attachment A1 — Design Review Process Map" title="Attachment A1 — Design Review Process Map"/>
             <wp:cNvGraphicFramePr>
@@ -5356,7 +5356,7 @@
                   <pic:spPr bwMode="auto">
                     <a:xfrm>
                       <a:off x="0" y="0"/>
-                      <a:ext cx="2343150" cy="4476750"/>
+                      <a:ext cx="4095750" cy="4343400"/>
                     </a:xfrm>
                     <a:prstGeom prst="rect">
                       <a:avLst/>

</xml_diff>